<commit_message>
Add LED emitter candidate shortlist to NP-PROC-FPC-001 Rev B (Issue #9)
Updates NP-PROC-FPC-001 to Rev B with §2.6.1–2.6.3:
- §2.6.1: 660nm candidates — Luminus SST-10-DR (primary), ams-OSRAM
  GH CS8PM1.24 OSLON SSL 80 (secondary), Cree XP-E2 Photo Red (backup)
- §2.6.2: 808–830nm candidates — ams-OSRAM SFH 4780S 820nm (primary);
  commodity 2835/3535 PBM emitters noted with Tier 1 supplier caveat
- §2.6.3: Seven open items (OI-LED-01 through OI-LED-07); two are
  BLOCKING for BOM lock: SFH 4780S Vf at 150mA (OI-LED-01) and beam
  angle bench verification against PDMS window (OI-LED-02)

660nm: SST-10-DR-B90-H660 ready to lock pending L70 confirmation.
808-830nm: Cannot lock part number until Vf and beam angle are confirmed.

https://claude.ai/code/session_01QrLjr59U9q75JrHp8hUYNf
</commit_message>
<xml_diff>
--- a/docs/neuropulse_fpc_procurement_requirements.docx
+++ b/docs/neuropulse_fpc_procurement_requirements.docx
@@ -54,17 +54,7 @@
         <w:jc w:val="center"/>
       </w:pPr>
       <w:r>
-        <w:rPr>
-          <w:b/>
-          <w:sz w:val="20"/>
-        </w:rPr>
-        <w:t xml:space="preserve">Revision:  </w:t>
-      </w:r>
-      <w:r>
-        <w:rPr>
-          <w:sz w:val="20"/>
-        </w:rPr>
-        <w:t>A  —  2026-05-06</w:t>
+        <w:t>Revision:  B  —  2026-05-08</w:t>
       </w:r>
     </w:p>
     <w:p>
@@ -2614,13 +2604,1233 @@
         <w:ind w:left="288"/>
       </w:pPr>
       <w:r>
-        <w:rPr>
-          <w:i/>
-          <w:sz w:val="19"/>
-        </w:rPr>
-        <w:t>No supplier is yet fully qualified. "Primary" status means the supplier has been identified as likely capable. Full qualification requires: (1) sample lot with Vf certificate; (2) incoming inspection pass; (3) prototype build and functional test. Qualification must be completed before production orders are placed.</w:t>
+        <w:t>No supplier is yet fully qualified. "Primary" status means the supplier has been identified as likely capable based on datasheet research (Issue #9, 2026-05-08). Full qualification requires: (1) sample lot with Vf certificate; (2) incoming inspection pass; (3) prototype build and functional test. Qualification must be completed before production orders are placed.</w:t>
       </w:r>
     </w:p>
+    <w:p>
+      <w:r>
+        <w:rPr>
+          <w:b/>
+        </w:rPr>
+        <w:t>2.6.1  Candidate Emitters — 660 nm (Deep Red)</w:t>
+      </w:r>
+    </w:p>
+    <w:tbl>
+      <w:tblPr>
+        <w:tblStyle w:val="TableGrid"/>
+        <w:tblW w:type="auto" w:w="0"/>
+        <w:tblLook w:firstColumn="1" w:firstRow="1" w:lastColumn="0" w:lastRow="0" w:noHBand="0" w:noVBand="1" w:val="04A0"/>
+      </w:tblPr>
+      <w:tblGrid>
+        <w:gridCol w:w="1337"/>
+        <w:gridCol w:w="1337"/>
+        <w:gridCol w:w="1337"/>
+        <w:gridCol w:w="1337"/>
+        <w:gridCol w:w="1337"/>
+        <w:gridCol w:w="1337"/>
+        <w:gridCol w:w="1337"/>
+      </w:tblGrid>
+      <w:tr>
+        <w:tc>
+          <w:tcPr>
+            <w:tcW w:type="dxa" w:w="1337"/>
+          </w:tcPr>
+          <w:p>
+            <w:r/>
+            <w:r>
+              <w:rPr>
+                <w:b/>
+              </w:rPr>
+              <w:t>Parameter</w:t>
+            </w:r>
+          </w:p>
+        </w:tc>
+        <w:tc>
+          <w:tcPr>
+            <w:tcW w:type="dxa" w:w="1337"/>
+          </w:tcPr>
+          <w:p>
+            <w:r/>
+            <w:r>
+              <w:rPr>
+                <w:b/>
+              </w:rPr>
+              <w:t>Luminus SST-10-DR</w:t>
+              <w:br/>
+              <w:t>(PRIMARY)</w:t>
+            </w:r>
+          </w:p>
+        </w:tc>
+        <w:tc>
+          <w:tcPr>
+            <w:tcW w:type="dxa" w:w="1337"/>
+          </w:tcPr>
+          <w:p>
+            <w:r/>
+            <w:r>
+              <w:rPr>
+                <w:b/>
+              </w:rPr>
+              <w:t>ams-OSRAM GH CS8PM1.24</w:t>
+              <w:br/>
+              <w:t>(SECONDARY)</w:t>
+            </w:r>
+          </w:p>
+        </w:tc>
+        <w:tc>
+          <w:tcPr>
+            <w:tcW w:type="dxa" w:w="1337"/>
+          </w:tcPr>
+          <w:p>
+            <w:r/>
+            <w:r>
+              <w:rPr>
+                <w:b/>
+              </w:rPr>
+              <w:t>Cree XP-E2 660nm</w:t>
+              <w:br/>
+              <w:t>(BACKUP)</w:t>
+            </w:r>
+          </w:p>
+        </w:tc>
+        <w:tc>
+          <w:tcPr>
+            <w:tcW w:type="dxa" w:w="1337"/>
+          </w:tcPr>
+          <w:p>
+            <w:r/>
+            <w:r>
+              <w:rPr>
+                <w:b/>
+              </w:rPr>
+              <w:t>Required (NP-PROC-FPC-001 §2.3)</w:t>
+            </w:r>
+          </w:p>
+        </w:tc>
+        <w:tc>
+          <w:tcPr>
+            <w:tcW w:type="dxa" w:w="1337"/>
+          </w:tcPr>
+          <w:p>
+            <w:r/>
+            <w:r>
+              <w:rPr>
+                <w:b/>
+              </w:rPr>
+              <w:t>Confirmed?</w:t>
+            </w:r>
+          </w:p>
+        </w:tc>
+        <w:tc>
+          <w:tcPr>
+            <w:tcW w:type="dxa" w:w="1337"/>
+          </w:tcPr>
+          <w:p>
+            <w:r/>
+            <w:r>
+              <w:rPr>
+                <w:b/>
+              </w:rPr>
+              <w:t>Action required</w:t>
+            </w:r>
+          </w:p>
+        </w:tc>
+      </w:tr>
+      <w:tr>
+        <w:tc>
+          <w:tcPr>
+            <w:tcW w:type="dxa" w:w="1337"/>
+          </w:tcPr>
+          <w:p>
+            <w:r>
+              <w:t>Part number(s)</w:t>
+            </w:r>
+          </w:p>
+        </w:tc>
+        <w:tc>
+          <w:tcPr>
+            <w:tcW w:type="dxa" w:w="1337"/>
+          </w:tcPr>
+          <w:p>
+            <w:r>
+              <w:t>SST-10-DR-B90-H660</w:t>
+              <w:br/>
+              <w:t>SST-10-DR-B130-K660</w:t>
+            </w:r>
+          </w:p>
+        </w:tc>
+        <w:tc>
+          <w:tcPr>
+            <w:tcW w:type="dxa" w:w="1337"/>
+          </w:tcPr>
+          <w:p>
+            <w:r>
+              <w:t>GH CS8PM1.24-3T1U-1</w:t>
+              <w:br/>
+              <w:t>GH CS8PM1.24-4T2U-1</w:t>
+            </w:r>
+          </w:p>
+        </w:tc>
+        <w:tc>
+          <w:tcPr>
+            <w:tcW w:type="dxa" w:w="1337"/>
+          </w:tcPr>
+          <w:p>
+            <w:r>
+              <w:t>XPEBRD-L1-0000-00701</w:t>
+              <w:br/>
+              <w:t>(Photo Red, 660nm)</w:t>
+            </w:r>
+          </w:p>
+        </w:tc>
+        <w:tc>
+          <w:tcPr>
+            <w:tcW w:type="dxa" w:w="1337"/>
+          </w:tcPr>
+          <w:p>
+            <w:r>
+              <w:t>—</w:t>
+            </w:r>
+          </w:p>
+        </w:tc>
+        <w:tc>
+          <w:tcPr>
+            <w:tcW w:type="dxa" w:w="1337"/>
+          </w:tcPr>
+          <w:p>
+            <w:r>
+              <w:t>—</w:t>
+            </w:r>
+          </w:p>
+        </w:tc>
+        <w:tc>
+          <w:tcPr>
+            <w:tcW w:type="dxa" w:w="1337"/>
+          </w:tcPr>
+          <w:p>
+            <w:r>
+              <w:t>Place sample orders from all three; obtain Vf cert</w:t>
+            </w:r>
+          </w:p>
+        </w:tc>
+      </w:tr>
+      <w:tr>
+        <w:tc>
+          <w:tcPr>
+            <w:tcW w:type="dxa" w:w="1337"/>
+          </w:tcPr>
+          <w:p>
+            <w:r>
+              <w:t>Peak wavelength</w:t>
+            </w:r>
+          </w:p>
+        </w:tc>
+        <w:tc>
+          <w:tcPr>
+            <w:tcW w:type="dxa" w:w="1337"/>
+          </w:tcPr>
+          <w:p>
+            <w:r>
+              <w:t>660 nm</w:t>
+            </w:r>
+          </w:p>
+        </w:tc>
+        <w:tc>
+          <w:tcPr>
+            <w:tcW w:type="dxa" w:w="1337"/>
+          </w:tcPr>
+          <w:p>
+            <w:r>
+              <w:t>~655–665 nm (Hyper Red)</w:t>
+              <w:br/>
+              <w:t>confirm exact peak</w:t>
+            </w:r>
+          </w:p>
+        </w:tc>
+        <w:tc>
+          <w:tcPr>
+            <w:tcW w:type="dxa" w:w="1337"/>
+          </w:tcPr>
+          <w:p>
+            <w:r>
+              <w:t>660 nm (Photo Red)</w:t>
+            </w:r>
+          </w:p>
+        </w:tc>
+        <w:tc>
+          <w:tcPr>
+            <w:tcW w:type="dxa" w:w="1337"/>
+          </w:tcPr>
+          <w:p>
+            <w:r>
+              <w:t>655–670 nm ± 5 nm within order</w:t>
+            </w:r>
+          </w:p>
+        </w:tc>
+        <w:tc>
+          <w:tcPr>
+            <w:tcW w:type="dxa" w:w="1337"/>
+          </w:tcPr>
+          <w:p>
+            <w:r>
+              <w:t>SST-10-DR ✓</w:t>
+              <w:br/>
+              <w:t>GH CS8PM1.24 CONFIRM</w:t>
+            </w:r>
+          </w:p>
+        </w:tc>
+        <w:tc>
+          <w:tcPr>
+            <w:tcW w:type="dxa" w:w="1337"/>
+          </w:tcPr>
+          <w:p>
+            <w:r>
+              <w:t>Request λ cert from ams-OSRAM for GH CS8PM1.24</w:t>
+            </w:r>
+          </w:p>
+        </w:tc>
+      </w:tr>
+      <w:tr>
+        <w:tc>
+          <w:tcPr>
+            <w:tcW w:type="dxa" w:w="1337"/>
+          </w:tcPr>
+          <w:p>
+            <w:r>
+              <w:t>Package</w:t>
+            </w:r>
+          </w:p>
+        </w:tc>
+        <w:tc>
+          <w:tcPr>
+            <w:tcW w:type="dxa" w:w="1337"/>
+          </w:tcPr>
+          <w:p>
+            <w:r>
+              <w:t>3.45 × 3.45 × 2.33 mm</w:t>
+              <w:br/>
+              <w:t>ceramic, flat emission</w:t>
+            </w:r>
+          </w:p>
+        </w:tc>
+        <w:tc>
+          <w:tcPr>
+            <w:tcW w:type="dxa" w:w="1337"/>
+          </w:tcPr>
+          <w:p>
+            <w:r>
+              <w:t>3.0 × 3.0 mm</w:t>
+              <w:br/>
+              <w:t>ceramic, flat emission</w:t>
+            </w:r>
+          </w:p>
+        </w:tc>
+        <w:tc>
+          <w:tcPr>
+            <w:tcW w:type="dxa" w:w="1337"/>
+          </w:tcPr>
+          <w:p>
+            <w:r>
+              <w:t>3.45 × 3.45 mm</w:t>
+              <w:br/>
+              <w:t>ceramic, domed silicone</w:t>
+            </w:r>
+          </w:p>
+        </w:tc>
+        <w:tc>
+          <w:tcPr>
+            <w:tcW w:type="dxa" w:w="1337"/>
+          </w:tcPr>
+          <w:p>
+            <w:r>
+              <w:t>SMD ceramic ≤ 5 × 5 mm</w:t>
+              <w:br/>
+              <w:t>flat emission preferred</w:t>
+            </w:r>
+          </w:p>
+        </w:tc>
+        <w:tc>
+          <w:tcPr>
+            <w:tcW w:type="dxa" w:w="1337"/>
+          </w:tcPr>
+          <w:p>
+            <w:r>
+              <w:t>SST-10-DR ✓</w:t>
+              <w:br/>
+              <w:t>XP-E2 NOTE</w:t>
+            </w:r>
+          </w:p>
+        </w:tc>
+        <w:tc>
+          <w:tcPr>
+            <w:tcW w:type="dxa" w:w="1337"/>
+          </w:tcPr>
+          <w:p>
+            <w:r>
+              <w:t>XP-E2 domed lens may interfere with PDMS coupling — evaluate in optical bench test</w:t>
+            </w:r>
+          </w:p>
+        </w:tc>
+      </w:tr>
+      <w:tr>
+        <w:tc>
+          <w:tcPr>
+            <w:tcW w:type="dxa" w:w="1337"/>
+          </w:tcPr>
+          <w:p>
+            <w:r>
+              <w:t>Vf at 150 mA, 25°C (est.)</w:t>
+            </w:r>
+          </w:p>
+        </w:tc>
+        <w:tc>
+          <w:tcPr>
+            <w:tcW w:type="dxa" w:w="1337"/>
+          </w:tcPr>
+          <w:p>
+            <w:r>
+              <w:t>~1.85–1.95 V (est. from Vf=2.05V @350mA curve)</w:t>
+            </w:r>
+          </w:p>
+        </w:tc>
+        <w:tc>
+          <w:tcPr>
+            <w:tcW w:type="dxa" w:w="1337"/>
+          </w:tcPr>
+          <w:p>
+            <w:r>
+              <w:t>~2.0–2.1 V (est.)</w:t>
+            </w:r>
+          </w:p>
+        </w:tc>
+        <w:tc>
+          <w:tcPr>
+            <w:tcW w:type="dxa" w:w="1337"/>
+          </w:tcPr>
+          <w:p>
+            <w:r>
+              <w:t>~1.95–2.05 V (est.)</w:t>
+            </w:r>
+          </w:p>
+        </w:tc>
+        <w:tc>
+          <w:tcPr>
+            <w:tcW w:type="dxa" w:w="1337"/>
+          </w:tcPr>
+          <w:p>
+            <w:r>
+              <w:t>2.0–2.2 V (confirm from datasheet)</w:t>
+            </w:r>
+          </w:p>
+        </w:tc>
+        <w:tc>
+          <w:tcPr>
+            <w:tcW w:type="dxa" w:w="1337"/>
+          </w:tcPr>
+          <w:p>
+            <w:r>
+              <w:t>ESTIMATE — datasheet</w:t>
+              <w:br/>
+              <w:t>curve read required</w:t>
+            </w:r>
+          </w:p>
+        </w:tc>
+        <w:tc>
+          <w:tcPr>
+            <w:tcW w:type="dxa" w:w="1337"/>
+          </w:tcPr>
+          <w:p>
+            <w:r>
+              <w:t>Measure Vf at 150 mA on 10 samples at incoming inspection</w:t>
+            </w:r>
+          </w:p>
+        </w:tc>
+      </w:tr>
+      <w:tr>
+        <w:tc>
+          <w:tcPr>
+            <w:tcW w:type="dxa" w:w="1337"/>
+          </w:tcPr>
+          <w:p>
+            <w:r>
+              <w:t>If_max DC</w:t>
+            </w:r>
+          </w:p>
+        </w:tc>
+        <w:tc>
+          <w:tcPr>
+            <w:tcW w:type="dxa" w:w="1337"/>
+          </w:tcPr>
+          <w:p>
+            <w:r>
+              <w:t>700 mA</w:t>
+              <w:br/>
+              <w:t>(3.9× margin over 180mA ✓)</w:t>
+            </w:r>
+          </w:p>
+        </w:tc>
+        <w:tc>
+          <w:tcPr>
+            <w:tcW w:type="dxa" w:w="1337"/>
+          </w:tcPr>
+          <w:p>
+            <w:r>
+              <w:t>350 mA</w:t>
+              <w:br/>
+              <w:t>(1.9× margin — marginal)</w:t>
+            </w:r>
+          </w:p>
+        </w:tc>
+        <w:tc>
+          <w:tcPr>
+            <w:tcW w:type="dxa" w:w="1337"/>
+          </w:tcPr>
+          <w:p>
+            <w:r>
+              <w:t>700 mA</w:t>
+              <w:br/>
+              <w:t>(3.9× margin ✓)</w:t>
+            </w:r>
+          </w:p>
+        </w:tc>
+        <w:tc>
+          <w:tcPr>
+            <w:tcW w:type="dxa" w:w="1337"/>
+          </w:tcPr>
+          <w:p>
+            <w:r>
+              <w:t>≥ 350 mA (2× margin over</w:t>
+              <w:br/>
+              <w:t>180 mA operating)</w:t>
+            </w:r>
+          </w:p>
+        </w:tc>
+        <w:tc>
+          <w:tcPr>
+            <w:tcW w:type="dxa" w:w="1337"/>
+          </w:tcPr>
+          <w:p>
+            <w:r>
+              <w:t>SST-10-DR ✓</w:t>
+              <w:br/>
+              <w:t>XP-E2 ✓</w:t>
+              <w:br/>
+              <w:t>GH CS8PM1.24 MARGINAL</w:t>
+            </w:r>
+          </w:p>
+        </w:tc>
+        <w:tc>
+          <w:tcPr>
+            <w:tcW w:type="dxa" w:w="1337"/>
+          </w:tcPr>
+          <w:p>
+            <w:r>
+              <w:t>GH CS8PM1.24 pulsed If_peak from full datasheet required — confirm &gt;350mA pulsed at ≤25% DC</w:t>
+            </w:r>
+          </w:p>
+        </w:tc>
+      </w:tr>
+      <w:tr>
+        <w:tc>
+          <w:tcPr>
+            <w:tcW w:type="dxa" w:w="1337"/>
+          </w:tcPr>
+          <w:p>
+            <w:r>
+              <w:t>L70 lifetime (at 150 mA)</w:t>
+            </w:r>
+          </w:p>
+        </w:tc>
+        <w:tc>
+          <w:tcPr>
+            <w:tcW w:type="dxa" w:w="1337"/>
+          </w:tcPr>
+          <w:p>
+            <w:r>
+              <w:t>&gt;80,000 h (extrapolated</w:t>
+              <w:br/>
+              <w:t>from &gt;50,000h @350mA)</w:t>
+            </w:r>
+          </w:p>
+        </w:tc>
+        <w:tc>
+          <w:tcPr>
+            <w:tcW w:type="dxa" w:w="1337"/>
+          </w:tcPr>
+          <w:p>
+            <w:r>
+              <w:t>&gt;50,000 h @ 350mA</w:t>
+              <w:br/>
+              <w:t>(extrapolation needed)</w:t>
+            </w:r>
+          </w:p>
+        </w:tc>
+        <w:tc>
+          <w:tcPr>
+            <w:tcW w:type="dxa" w:w="1337"/>
+          </w:tcPr>
+          <w:p>
+            <w:r>
+              <w:t>&gt;50,000 h @ 700mA</w:t>
+              <w:br/>
+              <w:t>(extrapolation needed)</w:t>
+            </w:r>
+          </w:p>
+        </w:tc>
+        <w:tc>
+          <w:tcPr>
+            <w:tcW w:type="dxa" w:w="1337"/>
+          </w:tcPr>
+          <w:p>
+            <w:r>
+              <w:t>≥ 80,000 h at rated</w:t>
+              <w:br/>
+              <w:t>drive current</w:t>
+            </w:r>
+          </w:p>
+        </w:tc>
+        <w:tc>
+          <w:tcPr>
+            <w:tcW w:type="dxa" w:w="1337"/>
+          </w:tcPr>
+          <w:p>
+            <w:r>
+              <w:t>SST-10-DR LIKELY ✓</w:t>
+              <w:br/>
+              <w:t>Others: CONFIRM</w:t>
+            </w:r>
+          </w:p>
+        </w:tc>
+        <w:tc>
+          <w:tcPr>
+            <w:tcW w:type="dxa" w:w="1337"/>
+          </w:tcPr>
+          <w:p>
+            <w:r>
+              <w:t>Request L70 data at 150 mA from each supplier or apply Arrhenius extrapolation from published curves</w:t>
+            </w:r>
+          </w:p>
+        </w:tc>
+      </w:tr>
+      <w:tr>
+        <w:tc>
+          <w:tcPr>
+            <w:tcW w:type="dxa" w:w="1337"/>
+          </w:tcPr>
+          <w:p>
+            <w:r>
+              <w:t>Vf binning ±0.10 V</w:t>
+            </w:r>
+          </w:p>
+        </w:tc>
+        <w:tc>
+          <w:tcPr>
+            <w:tcW w:type="dxa" w:w="1337"/>
+          </w:tcPr>
+          <w:p>
+            <w:r>
+              <w:t>Yes — Luminus named as capable in §2.6</w:t>
+            </w:r>
+          </w:p>
+        </w:tc>
+        <w:tc>
+          <w:tcPr>
+            <w:tcW w:type="dxa" w:w="1337"/>
+          </w:tcPr>
+          <w:p>
+            <w:r>
+              <w:t>Yes — ams-OSRAM named as capable in §2.6</w:t>
+            </w:r>
+          </w:p>
+        </w:tc>
+        <w:tc>
+          <w:tcPr>
+            <w:tcW w:type="dxa" w:w="1337"/>
+          </w:tcPr>
+          <w:p>
+            <w:r>
+              <w:t>Confirm with Cree</w:t>
+            </w:r>
+          </w:p>
+        </w:tc>
+        <w:tc>
+          <w:tcPr>
+            <w:tcW w:type="dxa" w:w="1337"/>
+          </w:tcPr>
+          <w:p>
+            <w:r>
+              <w:t>Mandatory — ±0.10 V within order; ±0.15 V between lots</w:t>
+            </w:r>
+          </w:p>
+        </w:tc>
+        <w:tc>
+          <w:tcPr>
+            <w:tcW w:type="dxa" w:w="1337"/>
+          </w:tcPr>
+          <w:p>
+            <w:r>
+              <w:t>Luminus ✓</w:t>
+              <w:br/>
+              <w:t>ams-OSRAM ✓</w:t>
+              <w:br/>
+              <w:t>Cree: CONFIRM</w:t>
+            </w:r>
+          </w:p>
+        </w:tc>
+        <w:tc>
+          <w:tcPr>
+            <w:tcW w:type="dxa" w:w="1337"/>
+          </w:tcPr>
+          <w:p>
+            <w:r>
+              <w:t>Request Vf distribution cert with first sample order</w:t>
+            </w:r>
+          </w:p>
+        </w:tc>
+      </w:tr>
+    </w:tbl>
+    <w:p>
+      <w:r>
+        <w:rPr>
+          <w:b/>
+        </w:rPr>
+        <w:t>2.6.2  Candidate Emitters — 808–830 nm (NIR)</w:t>
+      </w:r>
+    </w:p>
+    <w:tbl>
+      <w:tblPr>
+        <w:tblStyle w:val="TableGrid"/>
+        <w:tblW w:type="auto" w:w="0"/>
+        <w:tblLook w:firstColumn="1" w:firstRow="1" w:lastColumn="0" w:lastRow="0" w:noHBand="0" w:noVBand="1" w:val="04A0"/>
+      </w:tblPr>
+      <w:tblGrid>
+        <w:gridCol w:w="1872"/>
+        <w:gridCol w:w="1872"/>
+        <w:gridCol w:w="1872"/>
+        <w:gridCol w:w="1872"/>
+        <w:gridCol w:w="1872"/>
+      </w:tblGrid>
+      <w:tr>
+        <w:tc>
+          <w:tcPr>
+            <w:tcW w:type="dxa" w:w="1872"/>
+          </w:tcPr>
+          <w:p>
+            <w:r/>
+            <w:r>
+              <w:rPr>
+                <w:b/>
+              </w:rPr>
+              <w:t>Parameter</w:t>
+            </w:r>
+          </w:p>
+        </w:tc>
+        <w:tc>
+          <w:tcPr>
+            <w:tcW w:type="dxa" w:w="1872"/>
+          </w:tcPr>
+          <w:p>
+            <w:r/>
+            <w:r>
+              <w:rPr>
+                <w:b/>
+              </w:rPr>
+              <w:t>ams-OSRAM SFH 4780S</w:t>
+              <w:br/>
+              <w:t>(PRIMARY CANDIDATE)</w:t>
+            </w:r>
+          </w:p>
+        </w:tc>
+        <w:tc>
+          <w:tcPr>
+            <w:tcW w:type="dxa" w:w="1872"/>
+          </w:tcPr>
+          <w:p>
+            <w:r/>
+            <w:r>
+              <w:rPr>
+                <w:b/>
+              </w:rPr>
+              <w:t>Commodity 2835/3535 NIR</w:t>
+              <w:br/>
+              <w:t>810–820 nm (e.g. RZX LED,</w:t>
+              <w:br/>
+              <w:t>Shining Opto, GMKJ)</w:t>
+            </w:r>
+          </w:p>
+        </w:tc>
+        <w:tc>
+          <w:tcPr>
+            <w:tcW w:type="dxa" w:w="1872"/>
+          </w:tcPr>
+          <w:p>
+            <w:r/>
+            <w:r>
+              <w:rPr>
+                <w:b/>
+              </w:rPr>
+              <w:t>Required (NP-PROC-FPC-001 §2.3)</w:t>
+            </w:r>
+          </w:p>
+        </w:tc>
+        <w:tc>
+          <w:tcPr>
+            <w:tcW w:type="dxa" w:w="1872"/>
+          </w:tcPr>
+          <w:p>
+            <w:r/>
+            <w:r>
+              <w:rPr>
+                <w:b/>
+              </w:rPr>
+              <w:t>Action required</w:t>
+            </w:r>
+          </w:p>
+        </w:tc>
+      </w:tr>
+      <w:tr>
+        <w:tc>
+          <w:tcPr>
+            <w:tcW w:type="dxa" w:w="1872"/>
+          </w:tcPr>
+          <w:p>
+            <w:r>
+              <w:t>Part number / family</w:t>
+            </w:r>
+          </w:p>
+        </w:tc>
+        <w:tc>
+          <w:tcPr>
+            <w:tcW w:type="dxa" w:w="1872"/>
+          </w:tcPr>
+          <w:p>
+            <w:r>
+              <w:t>SFH 4780S (standard)</w:t>
+              <w:br/>
+              <w:t>SFH 4780S ID (tape-and-reel)</w:t>
+            </w:r>
+          </w:p>
+        </w:tc>
+        <w:tc>
+          <w:tcPr>
+            <w:tcW w:type="dxa" w:w="1872"/>
+          </w:tcPr>
+          <w:p>
+            <w:r>
+              <w:t>No established part number — custom quote required from supplier. Example: RZX-2835-810nm or GMKJ 3535-820nm.</w:t>
+            </w:r>
+          </w:p>
+        </w:tc>
+        <w:tc>
+          <w:tcPr>
+            <w:tcW w:type="dxa" w:w="1872"/>
+          </w:tcPr>
+          <w:p>
+            <w:r>
+              <w:t>—</w:t>
+            </w:r>
+          </w:p>
+        </w:tc>
+        <w:tc>
+          <w:tcPr>
+            <w:tcW w:type="dxa" w:w="1872"/>
+          </w:tcPr>
+          <w:p>
+            <w:r>
+              <w:t>Request samples: SFH 4780S from ams-OSRAM. Request samples + Vf cert from ≥ 1 commodity supplier for qualification comparison.</w:t>
+            </w:r>
+          </w:p>
+        </w:tc>
+      </w:tr>
+      <w:tr>
+        <w:tc>
+          <w:tcPr>
+            <w:tcW w:type="dxa" w:w="1872"/>
+          </w:tcPr>
+          <w:p>
+            <w:r>
+              <w:t>Peak wavelength</w:t>
+            </w:r>
+          </w:p>
+        </w:tc>
+        <w:tc>
+          <w:tcPr>
+            <w:tcW w:type="dxa" w:w="1872"/>
+          </w:tcPr>
+          <w:p>
+            <w:r>
+              <w:t>820 nm (centroid 810 nm)</w:t>
+              <w:br/>
+              <w:t>Within 808–830 nm range ✓</w:t>
+            </w:r>
+          </w:p>
+        </w:tc>
+        <w:tc>
+          <w:tcPr>
+            <w:tcW w:type="dxa" w:w="1872"/>
+          </w:tcPr>
+          <w:p>
+            <w:r>
+              <w:t>808–820 nm (manufacturer-stated; verify with spectrometer)</w:t>
+            </w:r>
+          </w:p>
+        </w:tc>
+        <w:tc>
+          <w:tcPr>
+            <w:tcW w:type="dxa" w:w="1872"/>
+          </w:tcPr>
+          <w:p>
+            <w:r>
+              <w:t>805–835 nm ± 10 nm</w:t>
+              <w:br/>
+              <w:t>within order</w:t>
+            </w:r>
+          </w:p>
+        </w:tc>
+        <w:tc>
+          <w:tcPr>
+            <w:tcW w:type="dxa" w:w="1872"/>
+          </w:tcPr>
+          <w:p>
+            <w:r>
+              <w:t>Request wavelength cert (λ mean, σ) from both. Verify with in-house spectrometer on 5 sample units per lot.</w:t>
+            </w:r>
+          </w:p>
+        </w:tc>
+      </w:tr>
+      <w:tr>
+        <w:tc>
+          <w:tcPr>
+            <w:tcW w:type="dxa" w:w="1872"/>
+          </w:tcPr>
+          <w:p>
+            <w:r>
+              <w:t>Package / beam angle</w:t>
+            </w:r>
+          </w:p>
+        </w:tc>
+        <w:tc>
+          <w:tcPr>
+            <w:tcW w:type="dxa" w:w="1872"/>
+          </w:tcPr>
+          <w:p>
+            <w:r>
+              <w:t>3.5 × 3.5 × 2.39 mm ceramic</w:t>
+              <w:br/>
+              <w:t>OSLUX — ±10° half angle (NARROW)</w:t>
+              <w:br/>
+              <w:t>⚠ CONCERN: Concentrated spot pattern</w:t>
+            </w:r>
+          </w:p>
+        </w:tc>
+        <w:tc>
+          <w:tcPr>
+            <w:tcW w:type="dxa" w:w="1872"/>
+          </w:tcPr>
+          <w:p>
+            <w:r>
+              <w:t>2835 (2.8 × 3.5 mm) or 3535 (3.5 × 3.5 mm) ceramic; ~120° Lambertian ✓</w:t>
+            </w:r>
+          </w:p>
+        </w:tc>
+        <w:tc>
+          <w:tcPr>
+            <w:tcW w:type="dxa" w:w="1872"/>
+          </w:tcPr>
+          <w:p>
+            <w:r>
+              <w:t>SMD ceramic ≤ 5 × 5 mm.</w:t>
+              <w:br/>
+              <w:t>Wide-angle (Lambertian, ≥ 120°) preferred for uniform scalp irradiance ±15–25%</w:t>
+            </w:r>
+          </w:p>
+        </w:tc>
+        <w:tc>
+          <w:tcPr>
+            <w:tcW w:type="dxa" w:w="1872"/>
+          </w:tcPr>
+          <w:p>
+            <w:r>
+              <w:t>⚠ SFH 4780S ±10° beam angle is a design risk for irradiance uniformity. Measure irradiance uniformity with SFH 4780S + PDMS window on bench before tooling decision. If unacceptable, commodity wide-angle emitter must be qualified.</w:t>
+            </w:r>
+          </w:p>
+        </w:tc>
+      </w:tr>
+      <w:tr>
+        <w:tc>
+          <w:tcPr>
+            <w:tcW w:type="dxa" w:w="1872"/>
+          </w:tcPr>
+          <w:p>
+            <w:r>
+              <w:t>Vf at 150 mA, 25°C</w:t>
+            </w:r>
+          </w:p>
+        </w:tc>
+        <w:tc>
+          <w:tcPr>
+            <w:tcW w:type="dxa" w:w="1872"/>
+          </w:tcPr>
+          <w:p>
+            <w:r>
+              <w:t>Estimated ~2.0–2.2 V from</w:t>
+              <w:br/>
+              <w:t>Vf=3.3V @500mA DC curve.</w:t>
+              <w:br/>
+              <w:t>⚠ CONFIRM from full datasheet Vf-IF curve</w:t>
+            </w:r>
+          </w:p>
+        </w:tc>
+        <w:tc>
+          <w:tcPr>
+            <w:tcW w:type="dxa" w:w="1872"/>
+          </w:tcPr>
+          <w:p>
+            <w:r>
+              <w:t>~1.6–1.8 V (manufacturer-stated at low current)</w:t>
+              <w:br/>
+              <w:t>Confirm at 150 mA</w:t>
+            </w:r>
+          </w:p>
+        </w:tc>
+        <w:tc>
+          <w:tcPr>
+            <w:tcW w:type="dxa" w:w="1872"/>
+          </w:tcPr>
+          <w:p>
+            <w:r>
+              <w:t>1.6–1.8 V (confirm from datasheet)</w:t>
+            </w:r>
+          </w:p>
+        </w:tc>
+        <w:tc>
+          <w:tcPr>
+            <w:tcW w:type="dxa" w:w="1872"/>
+          </w:tcPr>
+          <w:p>
+            <w:r>
+              <w:t>⚠ CRITICAL: String topology (series LED count per 15V VLED rail) cannot be finalized until Vf at 150mA is confirmed for selected emitter. BCR421W RSET value depends on this.</w:t>
+            </w:r>
+          </w:p>
+        </w:tc>
+      </w:tr>
+      <w:tr>
+        <w:tc>
+          <w:tcPr>
+            <w:tcW w:type="dxa" w:w="1872"/>
+          </w:tcPr>
+          <w:p>
+            <w:r>
+              <w:t>If_max DC</w:t>
+            </w:r>
+          </w:p>
+        </w:tc>
+        <w:tc>
+          <w:tcPr>
+            <w:tcW w:type="dxa" w:w="1872"/>
+          </w:tcPr>
+          <w:p>
+            <w:r>
+              <w:t>500 mA</w:t>
+              <w:br/>
+              <w:t>(2.8× margin over 180mA ✓)</w:t>
+            </w:r>
+          </w:p>
+        </w:tc>
+        <w:tc>
+          <w:tcPr>
+            <w:tcW w:type="dxa" w:w="1872"/>
+          </w:tcPr>
+          <w:p>
+            <w:r>
+              <w:t>Typically 300–500 mA for</w:t>
+              <w:br/>
+              <w:t>3535 3W class</w:t>
+              <w:br/>
+              <w:t>(confirm per supplier)</w:t>
+            </w:r>
+          </w:p>
+        </w:tc>
+        <w:tc>
+          <w:tcPr>
+            <w:tcW w:type="dxa" w:w="1872"/>
+          </w:tcPr>
+          <w:p>
+            <w:r>
+              <w:t>≥ 350 mA (2× margin)</w:t>
+            </w:r>
+          </w:p>
+        </w:tc>
+        <w:tc>
+          <w:tcPr>
+            <w:tcW w:type="dxa" w:w="1872"/>
+          </w:tcPr>
+          <w:p>
+            <w:r>
+              <w:t>Confirm If_max from full datasheet for each candidate. Commodity suppliers may not publish peak pulsed current ratings — require written confirmation.</w:t>
+            </w:r>
+          </w:p>
+        </w:tc>
+      </w:tr>
+      <w:tr>
+        <w:tc>
+          <w:tcPr>
+            <w:tcW w:type="dxa" w:w="1872"/>
+          </w:tcPr>
+          <w:p>
+            <w:r>
+              <w:t>L70 lifetime (at 150 mA)</w:t>
+            </w:r>
+          </w:p>
+        </w:tc>
+        <w:tc>
+          <w:tcPr>
+            <w:tcW w:type="dxa" w:w="1872"/>
+          </w:tcPr>
+          <w:p>
+            <w:r>
+              <w:t>OSLUX premium product — estimated &gt;100,000 h at 150 mA based on family positioning. Confirm from ams-OSRAM applications team.</w:t>
+            </w:r>
+          </w:p>
+        </w:tc>
+        <w:tc>
+          <w:tcPr>
+            <w:tcW w:type="dxa" w:w="1872"/>
+          </w:tcPr>
+          <w:p>
+            <w:r>
+              <w:t>Not published by commodity suppliers. Require accelerated LM-80 data or equivalent.</w:t>
+            </w:r>
+          </w:p>
+        </w:tc>
+        <w:tc>
+          <w:tcPr>
+            <w:tcW w:type="dxa" w:w="1872"/>
+          </w:tcPr>
+          <w:p>
+            <w:r>
+              <w:t>≥ 80,000 h at rated</w:t>
+              <w:br/>
+              <w:t>drive current</w:t>
+            </w:r>
+          </w:p>
+        </w:tc>
+        <w:tc>
+          <w:tcPr>
+            <w:tcW w:type="dxa" w:w="1872"/>
+          </w:tcPr>
+          <w:p>
+            <w:r>
+              <w:t>Request published L70 data or LM-80 report from ams-OSRAM for SFH 4780S. Commodity suppliers unlikely to have LM-80 — this is a qualification risk.</w:t>
+            </w:r>
+          </w:p>
+        </w:tc>
+      </w:tr>
+      <w:tr>
+        <w:tc>
+          <w:tcPr>
+            <w:tcW w:type="dxa" w:w="1872"/>
+          </w:tcPr>
+          <w:p>
+            <w:r>
+              <w:t>Tier 1 supplier status</w:t>
+            </w:r>
+          </w:p>
+        </w:tc>
+        <w:tc>
+          <w:tcPr>
+            <w:tcW w:type="dxa" w:w="1872"/>
+          </w:tcPr>
+          <w:p>
+            <w:r>
+              <w:t>Yes — ams-OSRAM is Tier 1,</w:t>
+              <w:br/>
+              <w:t>named primary in §2.6 ✓</w:t>
+            </w:r>
+          </w:p>
+        </w:tc>
+        <w:tc>
+          <w:tcPr>
+            <w:tcW w:type="dxa" w:w="1872"/>
+          </w:tcPr>
+          <w:p>
+            <w:r>
+              <w:t>No — commodity/Tier 2–3 suppliers. Vf binning, traceability, and qualification data uncertain.</w:t>
+            </w:r>
+          </w:p>
+        </w:tc>
+        <w:tc>
+          <w:tcPr>
+            <w:tcW w:type="dxa" w:w="1872"/>
+          </w:tcPr>
+          <w:p>
+            <w:r>
+              <w:t>Tier 1 (Seoul Semi,</w:t>
+              <w:br/>
+              <w:t>ams-OSRAM, Luminus)</w:t>
+              <w:br/>
+              <w:t>strongly preferred</w:t>
+            </w:r>
+          </w:p>
+        </w:tc>
+        <w:tc>
+          <w:tcPr>
+            <w:tcW w:type="dxa" w:w="1872"/>
+          </w:tcPr>
+          <w:p>
+            <w:r>
+              <w:t>⚠ If SFH 4780S fails beam angle test, escalate immediately to ams-OSRAM applications engineering for alternative 820nm OSLON-family wide-angle emitter, or contact Seoul Semiconductor and Luminus for 820nm catalog parts before qualifying commodity suppliers.</w:t>
+            </w:r>
+          </w:p>
+        </w:tc>
+      </w:tr>
+    </w:tbl>
+    <w:p>
+      <w:r>
+        <w:rPr>
+          <w:b/>
+        </w:rPr>
+        <w:t>2.6.3  Open Items — LED Emitter Candidates (as of Issue #9, 2026-05-08)</w:t>
+      </w:r>
+    </w:p>
+    <w:p>
+      <w:r>
+        <w:t>OI-LED-01 [BLOCKING for BOM lock]: Confirm Vf of SFH 4780S at 150 mA from full ams-OSRAM datasheet Vf-IF curve. If Vf &gt; 2.0 V at 150 mA, recalculate 808nm string depth for 15V VLED rail and update Hub PCB specification.</w:t>
+      </w:r>
+    </w:p>
+    <w:p>
+      <w:r>
+        <w:t>OI-LED-02 [BLOCKING for BOM lock]: Bench-measure irradiance uniformity with SFH 4780S (±10° emitter) through PDMS window at 6mm LED pitch. If irradiance variation exceeds ±25%, SFH 4780S cannot be used — escalate to ams-OSRAM for wide-angle 820nm alternative.</w:t>
+      </w:r>
+    </w:p>
+    <w:p>
+      <w:r>
+        <w:t>OI-LED-03 [BLOCKING for BOM lock]: Confirm GH CS8PM1.24 exact peak wavelength reaches ≥ 655nm. "Hyper Red" product family spans 635–665nm — confirm specific bin used is within 655–670nm. Request wavelength cert.</w:t>
+      </w:r>
+    </w:p>
+    <w:p>
+      <w:r>
+        <w:t>OI-LED-04 [BLOCKING for BOM lock]: Obtain full pulsed current rating for GH CS8PM1.24 at ≤25% duty cycle. If If_peak(pulsed) &lt; 350mA, GH CS8PM1.24 cannot serve as secondary candidate — replace with Cree XP-E2 (after evaluating domed lens optical coupling).</w:t>
+      </w:r>
+    </w:p>
+    <w:p>
+      <w:r>
+        <w:t>OI-LED-05: Request L70 data at 150 mA from Luminus (SST-10-DR), ams-OSRAM (GH CS8PM1.24 + SFH 4780S). If published L70 is only at higher current, apply Arrhenius model to confirm ≥ 80,000h at 150mA.</w:t>
+      </w:r>
+    </w:p>
+    <w:p>
+      <w:r>
+        <w:t>OI-LED-06: Contact ams-OSRAM applications engineering to confirm whether an OSLON-family (wide-angle, Lambertian) emitter at 808–830nm exists in their catalog beyond SFH 4780S. If yes, characterize as primary NIR candidate.</w:t>
+      </w:r>
+    </w:p>
+    <w:p>
+      <w:r>
+        <w:t>OI-LED-07: Contact Seoul Semiconductor applications engineering re: catalog availability of 808–830nm SMD emitter with Tier 1 qualification. Seoul named as primary supplier in §2.6 but no specific 808–830nm part has been identified in their public catalog.</w:t>
+      </w:r>
+    </w:p>
+    <w:p/>
+    <w:p/>
+    <w:p/>
     <w:p>
       <w:pPr>
         <w:spacing w:before="280" w:after="80"/>
@@ -5868,6 +7078,48 @@
                 <w:sz w:val="19"/>
               </w:rPr>
               <w:t>Initial release. Addresses RISK-01 (connector), RISK-04 (PDMS), RISK-07 (BCR421W), RISK-08 (LED Vf binning), RISK-10 (RA copper) from NP-HW-FPC-001 Risk Register Rev A.</w:t>
+            </w:r>
+          </w:p>
+        </w:tc>
+      </w:tr>
+      <w:tr>
+        <w:tc>
+          <w:tcPr>
+            <w:tcW w:type="dxa" w:w="2340"/>
+          </w:tcPr>
+          <w:p>
+            <w:r>
+              <w:t>B</w:t>
+            </w:r>
+          </w:p>
+        </w:tc>
+        <w:tc>
+          <w:tcPr>
+            <w:tcW w:type="dxa" w:w="2340"/>
+          </w:tcPr>
+          <w:p>
+            <w:r>
+              <w:t>2026-05-08</w:t>
+            </w:r>
+          </w:p>
+        </w:tc>
+        <w:tc>
+          <w:tcPr>
+            <w:tcW w:type="dxa" w:w="2340"/>
+          </w:tcPr>
+          <w:p>
+            <w:r>
+              <w:t>Claude / NeuroPulse Engineering</w:t>
+            </w:r>
+          </w:p>
+        </w:tc>
+        <w:tc>
+          <w:tcPr>
+            <w:tcW w:type="dxa" w:w="2340"/>
+          </w:tcPr>
+          <w:p>
+            <w:r>
+              <w:t>Added §2.6.1–2.6.3: candidate emitter shortlist for 660nm (Luminus SST-10-DR primary, ams-OSRAM GH CS8PM1.24 secondary, Cree XP-E2 backup) and 808–830nm (ams-OSRAM SFH 4780S primary candidate). 7 open items documented (OI-LED-01 through OI-LED-07), two of which are BLOCKING for BOM lock (Vf confirmation at 150mA, beam angle verification). Addresses Issue #9.</w:t>
             </w:r>
           </w:p>
         </w:tc>

</xml_diff>

<commit_message>
Add OI-LED-W2 (808nm VCSEL T2 path) to NP-PROC-FPC-001 Rev B (Issue #9)
Laser diode analysis conclusion:
- EEL (edge-emitting): ruled out for FPC — TO-18/TO-56 packages are
  FPC-incompatible; coherent emission causes speckle incompatible with
  ±15-25% irradiance uniformity spec
- VCSEL 808nm: viable for T2 (FPC-compatible SMD packages exist, Vf
  ~1.8-2.0V compatible with BCR421W, lower coherence than EEL reduces
  speckle); requires IEC 60825-1 Class 1C safety analysis and FDA 21 CFR
  Part 1040 laser product registration — not appropriate for T1 wellness
- T1 recommendation: accept 850nm LED (L1IZ-0850, Option A); 20nm
  wavelength offset from 830nm is scientifically defensible; preserves
  IEC 62471 / FDA wellness exemption lane

OI-LED-W2 added: Lasermate VCx-808C300A (3535 SMD, 300mW CW) as primary
VCSEL candidate for T2 NIR emitter evaluation. Not blocking for T1.

https://claude.ai/code/session_01QrLjr59U9q75JrHp8hUYNf
</commit_message>
<xml_diff>
--- a/docs/neuropulse_fpc_procurement_requirements.docx
+++ b/docs/neuropulse_fpc_procurement_requirements.docx
@@ -3969,6 +3969,14 @@
     </w:p>
     <w:p/>
     <w:p>
+      <w:r>
+        <w:rPr>
+          <w:b w:val="0"/>
+        </w:rPr>
+        <w:t>OI-LED-W2 [T2 planning — not blocking T1]: Evaluate 808nm VCSEL (primary candidate: Lasermate VCx-808C300A, 3535 SMD, 300mW CW; secondary: 1ONELASER 808nm VCSEL SMD portfolio) as T2 NIR transcranial emitter upgrade over T1 850nm LED. Actions: (a) obtain full If-P and Vf-If datasheet curves from Lasermate; confirm optical output at 150mA pulsed meets ~100–145mW per emitter for 400 mW/cm² irradiance target at 6mm pitch; (b) initiate IEC 60825-1 Class 1C safety analysis with regulatory counsel — Class 1C is the correct classification pathway for scalp-contact laser PBM devices; (c) contact ams-OSRAM applications engineering for any unreleased 808nm VCSEL SMD catalog product (ams-OSRAM published SPIE 808nm VCSEL array research and may have a commercial product); (d) confirm Vf binning capability at production volume with selected VCSEL supplier. Note: EEL (edge-emitting) 808/830nm laser diodes are NOT viable for FPC zone module architecture — TO-18/TO-56 packages are FPC-incompatible and coherent EEL emission creates speckle incompatible with ±15–25% irradiance uniformity spec. VCSEL is the only practical laser architecture for FPC mounting. Not blocking for T1 BOM lock.</w:t>
+      </w:r>
+    </w:p>
+    <w:p>
       <w:pPr>
         <w:spacing w:before="280" w:after="80"/>
       </w:pPr>
@@ -7256,7 +7264,7 @@
           </w:tcPr>
           <w:p>
             <w:r>
-              <w:t>Rev B first pass (§2.6.1–2.6.3 added with initial candidates). Corrected in same session based on supplementary research: 660nm primary changed to ams-OSRAM GH CSSRM5.24 (L70 Q90 &gt;102Khr confirmed); NIR primary changed to Lumileds L1IZ-0850 (850nm); SFH 4703AS (820nm) flagged as Vf-incompatible with existing driver architecture; new BLOCKING item OI-LED-W1 (wavelength decision 820nm vs 850/860nm) added. Cree XP-G3 Photo Red (not XP-E2) confirmed as correct Cree 660nm family. Addresses Issue #9.</w:t>
+              <w:t>Rev B — LED emitter candidate shortlist added (§2.6.1–2.6.3). Corrected in same session: 660nm primary = ams-OSRAM GH CSSRM5.24 (OSLON Square, L70 Q90 &gt;102Khr); NIR primary = Lumileds L1IZ-0850 (850nm); SFH 4703AS (820nm LED) flagged Vf-incompatible; laser diode analysis added — EEL ruled out (FPC-incompatible + speckle); 808nm VCSEL viable for T2 (OI-LED-W2); 850nm LED recommended for T1 (OI-LED-W1 → Option A). Total open items: OI-LED-W1 through OI-LED-07 + OI-LED-W2. Addresses Issue #9.</w:t>
             </w:r>
           </w:p>
         </w:tc>

</xml_diff>